<commit_message>
feet : construction composant CSS
</commit_message>
<xml_diff>
--- a/docs/01_EP_Cahier_des_charges.docx
+++ b/docs/01_EP_Cahier_des_charges.docx
@@ -425,11 +425,19 @@
       </w:r>
     </w:p>
     <w:p>
+      <w:pPr>
+        <w:pStyle w:val="Sansinterligne"/>
+        <w:jc w:val="both"/>
+      </w:pPr>
       <w:r>
         <w:t xml:space="preserve">Ce site internet permettra de se créer une communauté passionnée de lecture et encourager les rencontres physiques pour se prêter les livres. </w:t>
       </w:r>
     </w:p>
-    <w:p/>
+    <w:p>
+      <w:pPr>
+        <w:pStyle w:val="Sansinterligne"/>
+      </w:pPr>
+    </w:p>
     <w:p>
       <w:pPr>
         <w:pStyle w:val="Titre1"/>
@@ -437,6 +445,8 @@
       <w:r>
         <w:t>Les objectifs</w:t>
       </w:r>
+      <w:bookmarkStart w:id="0" w:name="_GoBack"/>
+      <w:bookmarkEnd w:id="0"/>
     </w:p>
     <w:p>
       <w:pPr>
@@ -727,8 +737,6 @@
       <w:r>
         <w:t>pérées à partir du numéro ISBN.</w:t>
       </w:r>
-      <w:bookmarkStart w:id="0" w:name="_GoBack"/>
-      <w:bookmarkEnd w:id="0"/>
     </w:p>
     <w:p>
       <w:pPr>
@@ -2578,6 +2586,7 @@
     <w:rsid w:val="008021FA"/>
     <w:rsid w:val="00983A74"/>
     <w:rsid w:val="00B07570"/>
+    <w:rsid w:val="00E92373"/>
   </w:rsids>
   <m:mathPr>
     <m:mathFont m:val="Cambria Math"/>

</xml_diff>